<commit_message>
Miscellaneous - 7/7/2026 - part 2
</commit_message>
<xml_diff>
--- a/Miscellaneous Collection.docx
+++ b/Miscellaneous Collection.docx
@@ -793,7 +793,79 @@
         <w:t>Git Stages Image</w:t>
       </w:r>
     </w:p>
+    <w:p>
+      <w:pPr>
+        <w:pStyle w:val="ListParagraph"/>
+        <w:numPr>
+          <w:ilvl w:val="0"/>
+          <w:numId w:val="6"/>
+        </w:numPr>
+      </w:pPr>
+      <w:r>
+        <w:t xml:space="preserve">44: </w:t>
+      </w:r>
+      <w:r>
+        <w:t>Types of Databases</w:t>
+      </w:r>
+      <w:r>
+        <w:t xml:space="preserve"> </w:t>
+      </w:r>
+      <w:r>
+        <w:t>Image</w:t>
+      </w:r>
+    </w:p>
     <w:p/>
+    <w:p/>
+    <w:p/>
+    <w:p>
+      <w:pPr>
+        <w:pStyle w:val="Heading2"/>
+      </w:pPr>
+      <w:r>
+        <w:t>Science</w:t>
+      </w:r>
+    </w:p>
+    <w:p>
+      <w:pPr>
+        <w:pStyle w:val="Heading3"/>
+      </w:pPr>
+      <w:r>
+        <w:t>Set Theory</w:t>
+      </w:r>
+    </w:p>
+    <w:p>
+      <w:pPr>
+        <w:pStyle w:val="ListParagraph"/>
+        <w:numPr>
+          <w:ilvl w:val="0"/>
+          <w:numId w:val="6"/>
+        </w:numPr>
+      </w:pPr>
+      <w:r>
+        <w:t xml:space="preserve">45: </w:t>
+      </w:r>
+      <w:r>
+        <w:t>Circle Venn Diagrams Image</w:t>
+      </w:r>
+    </w:p>
+    <w:p>
+      <w:pPr>
+        <w:pStyle w:val="ListParagraph"/>
+        <w:numPr>
+          <w:ilvl w:val="0"/>
+          <w:numId w:val="6"/>
+        </w:numPr>
+      </w:pPr>
+      <w:r>
+        <w:t>46</w:t>
+      </w:r>
+      <w:r>
+        <w:t xml:space="preserve">: </w:t>
+      </w:r>
+      <w:r>
+        <w:t>Circle Venn Diagrams Image 2</w:t>
+      </w:r>
+    </w:p>
     <w:sectPr>
       <w:pgSz w:w="12240" w:h="15840"/>
       <w:pgMar w:top="1440" w:right="1440" w:bottom="1440" w:left="1440" w:header="720" w:footer="720" w:gutter="0"/>

</xml_diff>